<commit_message>
docs: set Review 2 date and embed real CLI screenshots
</commit_message>
<xml_diff>
--- a/docs/review2-document.docx
+++ b/docs/review2-document.docx
@@ -264,7 +264,7 @@
                 <w:b w:val="0"/>
                 <w:sz w:val="22"/>
               </w:rPr>
-              <w:t>[Insert Review 2 scheduled date]</w:t>
+              <w:t>21 October 2026</w:t>
             </w:r>
           </w:p>
         </w:tc>
@@ -801,10 +801,434 @@
       <w:r>
         <w:rPr>
           <w:rFonts w:ascii="Calibri" w:hAnsi="Calibri"/>
-          <w:i/>
+          <w:i w:val="0"/>
           <w:sz w:val="22"/>
         </w:rPr>
-        <w:t>[Insert terminal screenshots here: output of `auxflow tokens`, `auxflow ast`, `auxflow symbols`, `auxflow check`, and `auxflow graph` run against a sample document, per the companion viva guide docs/review2-viva.md.]</w:t>
+        <w:t>Captured from real `auxflow` runs against the project's own benchmark corpus (bench/corpus/). Each image shows the exact command and its unedited output.</w:t>
+      </w:r>
+    </w:p>
+    <w:p>
+      <w:pPr>
+        <w:jc w:val="center"/>
+      </w:pPr>
+      <w:r>
+        <w:drawing>
+          <wp:inline xmlns:a="http://schemas.openxmlformats.org/drawingml/2006/main" xmlns:pic="http://schemas.openxmlformats.org/drawingml/2006/picture">
+            <wp:extent cx="5580000" cy="2027020"/>
+            <wp:docPr id="1" name="Picture 1"/>
+            <wp:cNvGraphicFramePr>
+              <a:graphicFrameLocks noChangeAspect="1"/>
+            </wp:cNvGraphicFramePr>
+            <a:graphic>
+              <a:graphicData uri="http://schemas.openxmlformats.org/drawingml/2006/picture">
+                <pic:pic>
+                  <pic:nvPicPr>
+                    <pic:cNvPr id="0" name="01-tokens.png"/>
+                    <pic:cNvPicPr/>
+                  </pic:nvPicPr>
+                  <pic:blipFill>
+                    <a:blip r:embed="rId9"/>
+                    <a:stretch>
+                      <a:fillRect/>
+                    </a:stretch>
+                  </pic:blipFill>
+                  <pic:spPr>
+                    <a:xfrm>
+                      <a:off x="0" y="0"/>
+                      <a:ext cx="5580000" cy="2027020"/>
+                    </a:xfrm>
+                    <a:prstGeom prst="rect"/>
+                  </pic:spPr>
+                </pic:pic>
+              </a:graphicData>
+            </a:graphic>
+          </wp:inline>
+        </w:drawing>
+      </w:r>
+    </w:p>
+    <w:p>
+      <w:pPr>
+        <w:spacing w:after="200"/>
+        <w:jc w:val="center"/>
+      </w:pPr>
+      <w:r>
+        <w:rPr>
+          <w:i/>
+          <w:color w:val="5A5A5A"/>
+          <w:sz w:val="20"/>
+        </w:rPr>
+        <w:t>Phase 2, Lexical Analysis: auxflow tokens</w:t>
+      </w:r>
+    </w:p>
+    <w:p>
+      <w:pPr>
+        <w:jc w:val="center"/>
+      </w:pPr>
+      <w:r>
+        <w:drawing>
+          <wp:inline xmlns:a="http://schemas.openxmlformats.org/drawingml/2006/main" xmlns:pic="http://schemas.openxmlformats.org/drawingml/2006/picture">
+            <wp:extent cx="5580000" cy="2027020"/>
+            <wp:docPr id="2" name="Picture 2"/>
+            <wp:cNvGraphicFramePr>
+              <a:graphicFrameLocks noChangeAspect="1"/>
+            </wp:cNvGraphicFramePr>
+            <a:graphic>
+              <a:graphicData uri="http://schemas.openxmlformats.org/drawingml/2006/picture">
+                <pic:pic>
+                  <pic:nvPicPr>
+                    <pic:cNvPr id="0" name="02-ast.png"/>
+                    <pic:cNvPicPr/>
+                  </pic:nvPicPr>
+                  <pic:blipFill>
+                    <a:blip r:embed="rId10"/>
+                    <a:stretch>
+                      <a:fillRect/>
+                    </a:stretch>
+                  </pic:blipFill>
+                  <pic:spPr>
+                    <a:xfrm>
+                      <a:off x="0" y="0"/>
+                      <a:ext cx="5580000" cy="2027020"/>
+                    </a:xfrm>
+                    <a:prstGeom prst="rect"/>
+                  </pic:spPr>
+                </pic:pic>
+              </a:graphicData>
+            </a:graphic>
+          </wp:inline>
+        </w:drawing>
+      </w:r>
+    </w:p>
+    <w:p>
+      <w:pPr>
+        <w:spacing w:after="200"/>
+        <w:jc w:val="center"/>
+      </w:pPr>
+      <w:r>
+        <w:rPr>
+          <w:i/>
+          <w:color w:val="5A5A5A"/>
+          <w:sz w:val="20"/>
+        </w:rPr>
+        <w:t>Phase 3-4, Parsing and AST: auxflow ast</w:t>
+      </w:r>
+    </w:p>
+    <w:p>
+      <w:pPr>
+        <w:jc w:val="center"/>
+      </w:pPr>
+      <w:r>
+        <w:drawing>
+          <wp:inline xmlns:a="http://schemas.openxmlformats.org/drawingml/2006/main" xmlns:pic="http://schemas.openxmlformats.org/drawingml/2006/picture">
+            <wp:extent cx="5580000" cy="2027020"/>
+            <wp:docPr id="3" name="Picture 3"/>
+            <wp:cNvGraphicFramePr>
+              <a:graphicFrameLocks noChangeAspect="1"/>
+            </wp:cNvGraphicFramePr>
+            <a:graphic>
+              <a:graphicData uri="http://schemas.openxmlformats.org/drawingml/2006/picture">
+                <pic:pic>
+                  <pic:nvPicPr>
+                    <pic:cNvPr id="0" name="03-symbols.png"/>
+                    <pic:cNvPicPr/>
+                  </pic:nvPicPr>
+                  <pic:blipFill>
+                    <a:blip r:embed="rId11"/>
+                    <a:stretch>
+                      <a:fillRect/>
+                    </a:stretch>
+                  </pic:blipFill>
+                  <pic:spPr>
+                    <a:xfrm>
+                      <a:off x="0" y="0"/>
+                      <a:ext cx="5580000" cy="2027020"/>
+                    </a:xfrm>
+                    <a:prstGeom prst="rect"/>
+                  </pic:spPr>
+                </pic:pic>
+              </a:graphicData>
+            </a:graphic>
+          </wp:inline>
+        </w:drawing>
+      </w:r>
+    </w:p>
+    <w:p>
+      <w:pPr>
+        <w:spacing w:after="200"/>
+        <w:jc w:val="center"/>
+      </w:pPr>
+      <w:r>
+        <w:rPr>
+          <w:i/>
+          <w:color w:val="5A5A5A"/>
+          <w:sz w:val="20"/>
+        </w:rPr>
+        <w:t>Phase 5, Symbol Tables: auxflow symbols</w:t>
+      </w:r>
+    </w:p>
+    <w:p>
+      <w:pPr>
+        <w:jc w:val="center"/>
+      </w:pPr>
+      <w:r>
+        <w:drawing>
+          <wp:inline xmlns:a="http://schemas.openxmlformats.org/drawingml/2006/main" xmlns:pic="http://schemas.openxmlformats.org/drawingml/2006/picture">
+            <wp:extent cx="5580000" cy="1651224"/>
+            <wp:docPr id="4" name="Picture 4"/>
+            <wp:cNvGraphicFramePr>
+              <a:graphicFrameLocks noChangeAspect="1"/>
+            </wp:cNvGraphicFramePr>
+            <a:graphic>
+              <a:graphicData uri="http://schemas.openxmlformats.org/drawingml/2006/picture">
+                <pic:pic>
+                  <pic:nvPicPr>
+                    <pic:cNvPr id="0" name="04-check.png"/>
+                    <pic:cNvPicPr/>
+                  </pic:nvPicPr>
+                  <pic:blipFill>
+                    <a:blip r:embed="rId12"/>
+                    <a:stretch>
+                      <a:fillRect/>
+                    </a:stretch>
+                  </pic:blipFill>
+                  <pic:spPr>
+                    <a:xfrm>
+                      <a:off x="0" y="0"/>
+                      <a:ext cx="5580000" cy="1651224"/>
+                    </a:xfrm>
+                    <a:prstGeom prst="rect"/>
+                  </pic:spPr>
+                </pic:pic>
+              </a:graphicData>
+            </a:graphic>
+          </wp:inline>
+        </w:drawing>
+      </w:r>
+    </w:p>
+    <w:p>
+      <w:pPr>
+        <w:spacing w:after="200"/>
+        <w:jc w:val="center"/>
+      </w:pPr>
+      <w:r>
+        <w:rPr>
+          <w:i/>
+          <w:color w:val="5A5A5A"/>
+          <w:sz w:val="20"/>
+        </w:rPr>
+        <w:t>Phase 6, Semantic Analysis: auxflow check, clean and with errors</w:t>
+      </w:r>
+    </w:p>
+    <w:p>
+      <w:pPr>
+        <w:jc w:val="center"/>
+      </w:pPr>
+      <w:r>
+        <w:drawing>
+          <wp:inline xmlns:a="http://schemas.openxmlformats.org/drawingml/2006/main" xmlns:pic="http://schemas.openxmlformats.org/drawingml/2006/picture">
+            <wp:extent cx="5580000" cy="1400694"/>
+            <wp:docPr id="5" name="Picture 5"/>
+            <wp:cNvGraphicFramePr>
+              <a:graphicFrameLocks noChangeAspect="1"/>
+            </wp:cNvGraphicFramePr>
+            <a:graphic>
+              <a:graphicData uri="http://schemas.openxmlformats.org/drawingml/2006/picture">
+                <pic:pic>
+                  <pic:nvPicPr>
+                    <pic:cNvPr id="0" name="05-graph.png"/>
+                    <pic:cNvPicPr/>
+                  </pic:nvPicPr>
+                  <pic:blipFill>
+                    <a:blip r:embed="rId13"/>
+                    <a:stretch>
+                      <a:fillRect/>
+                    </a:stretch>
+                  </pic:blipFill>
+                  <pic:spPr>
+                    <a:xfrm>
+                      <a:off x="0" y="0"/>
+                      <a:ext cx="5580000" cy="1400694"/>
+                    </a:xfrm>
+                    <a:prstGeom prst="rect"/>
+                  </pic:spPr>
+                </pic:pic>
+              </a:graphicData>
+            </a:graphic>
+          </wp:inline>
+        </w:drawing>
+      </w:r>
+    </w:p>
+    <w:p>
+      <w:pPr>
+        <w:spacing w:after="200"/>
+        <w:jc w:val="center"/>
+      </w:pPr>
+      <w:r>
+        <w:rPr>
+          <w:i/>
+          <w:color w:val="5A5A5A"/>
+          <w:sz w:val="20"/>
+        </w:rPr>
+        <w:t>Phase 7, Intermediate Representation: auxflow graph (Graphviz DOT)</w:t>
+      </w:r>
+    </w:p>
+    <w:p>
+      <w:pPr>
+        <w:jc w:val="center"/>
+      </w:pPr>
+      <w:r>
+        <w:drawing>
+          <wp:inline xmlns:a="http://schemas.openxmlformats.org/drawingml/2006/main" xmlns:pic="http://schemas.openxmlformats.org/drawingml/2006/picture">
+            <wp:extent cx="5580000" cy="1525959"/>
+            <wp:docPr id="6" name="Picture 6"/>
+            <wp:cNvGraphicFramePr>
+              <a:graphicFrameLocks noChangeAspect="1"/>
+            </wp:cNvGraphicFramePr>
+            <a:graphic>
+              <a:graphicData uri="http://schemas.openxmlformats.org/drawingml/2006/picture">
+                <pic:pic>
+                  <pic:nvPicPr>
+                    <pic:cNvPr id="0" name="06-classify-certified.png"/>
+                    <pic:cNvPicPr/>
+                  </pic:nvPicPr>
+                  <pic:blipFill>
+                    <a:blip r:embed="rId14"/>
+                    <a:stretch>
+                      <a:fillRect/>
+                    </a:stretch>
+                  </pic:blipFill>
+                  <pic:spPr>
+                    <a:xfrm>
+                      <a:off x="0" y="0"/>
+                      <a:ext cx="5580000" cy="1525959"/>
+                    </a:xfrm>
+                    <a:prstGeom prst="rect"/>
+                  </pic:spPr>
+                </pic:pic>
+              </a:graphicData>
+            </a:graphic>
+          </wp:inline>
+        </w:drawing>
+      </w:r>
+    </w:p>
+    <w:p>
+      <w:pPr>
+        <w:spacing w:after="200"/>
+        <w:jc w:val="center"/>
+      </w:pPr>
+      <w:r>
+        <w:rPr>
+          <w:i/>
+          <w:color w:val="5A5A5A"/>
+          <w:sz w:val="20"/>
+        </w:rPr>
+        <w:t>Preview of Phase 11 classification: a CERTIFIED document</w:t>
+      </w:r>
+    </w:p>
+    <w:p>
+      <w:pPr>
+        <w:jc w:val="center"/>
+      </w:pPr>
+      <w:r>
+        <w:drawing>
+          <wp:inline xmlns:a="http://schemas.openxmlformats.org/drawingml/2006/main" xmlns:pic="http://schemas.openxmlformats.org/drawingml/2006/picture">
+            <wp:extent cx="5580000" cy="1901755"/>
+            <wp:docPr id="7" name="Picture 7"/>
+            <wp:cNvGraphicFramePr>
+              <a:graphicFrameLocks noChangeAspect="1"/>
+            </wp:cNvGraphicFramePr>
+            <a:graphic>
+              <a:graphicData uri="http://schemas.openxmlformats.org/drawingml/2006/picture">
+                <pic:pic>
+                  <pic:nvPicPr>
+                    <pic:cNvPr id="0" name="07-classify-amplifying.png"/>
+                    <pic:cNvPicPr/>
+                  </pic:nvPicPr>
+                  <pic:blipFill>
+                    <a:blip r:embed="rId15"/>
+                    <a:stretch>
+                      <a:fillRect/>
+                    </a:stretch>
+                  </pic:blipFill>
+                  <pic:spPr>
+                    <a:xfrm>
+                      <a:off x="0" y="0"/>
+                      <a:ext cx="5580000" cy="1901755"/>
+                    </a:xfrm>
+                    <a:prstGeom prst="rect"/>
+                  </pic:spPr>
+                </pic:pic>
+              </a:graphicData>
+            </a:graphic>
+          </wp:inline>
+        </w:drawing>
+      </w:r>
+    </w:p>
+    <w:p>
+      <w:pPr>
+        <w:spacing w:after="200"/>
+        <w:jc w:val="center"/>
+      </w:pPr>
+      <w:r>
+        <w:rPr>
+          <w:i/>
+          <w:color w:val="5A5A5A"/>
+          <w:sz w:val="20"/>
+        </w:rPr>
+        <w:t>Preview of Phase 11 classification: an AMPLIFYING document</w:t>
+      </w:r>
+    </w:p>
+    <w:p>
+      <w:pPr>
+        <w:jc w:val="center"/>
+      </w:pPr>
+      <w:r>
+        <w:drawing>
+          <wp:inline xmlns:a="http://schemas.openxmlformats.org/drawingml/2006/main" xmlns:pic="http://schemas.openxmlformats.org/drawingml/2006/picture">
+            <wp:extent cx="5580000" cy="1400694"/>
+            <wp:docPr id="8" name="Picture 8"/>
+            <wp:cNvGraphicFramePr>
+              <a:graphicFrameLocks noChangeAspect="1"/>
+            </wp:cNvGraphicFramePr>
+            <a:graphic>
+              <a:graphicData uri="http://schemas.openxmlformats.org/drawingml/2006/picture">
+                <pic:pic>
+                  <pic:nvPicPr>
+                    <pic:cNvPr id="0" name="08-verification.png"/>
+                    <pic:cNvPicPr/>
+                  </pic:nvPicPr>
+                  <pic:blipFill>
+                    <a:blip r:embed="rId16"/>
+                    <a:stretch>
+                      <a:fillRect/>
+                    </a:stretch>
+                  </pic:blipFill>
+                  <pic:spPr>
+                    <a:xfrm>
+                      <a:off x="0" y="0"/>
+                      <a:ext cx="5580000" cy="1400694"/>
+                    </a:xfrm>
+                    <a:prstGeom prst="rect"/>
+                  </pic:spPr>
+                </pic:pic>
+              </a:graphicData>
+            </a:graphic>
+          </wp:inline>
+        </w:drawing>
+      </w:r>
+    </w:p>
+    <w:p>
+      <w:pPr>
+        <w:spacing w:after="200"/>
+        <w:jc w:val="center"/>
+      </w:pPr>
+      <w:r>
+        <w:rPr>
+          <w:i/>
+          <w:color w:val="5A5A5A"/>
+          <w:sz w:val="20"/>
+        </w:rPr>
+        <w:t>Test suite, type check, and lint, all passing</w:t>
       </w:r>
     </w:p>
     <w:p>

</xml_diff>

<commit_message>
docs: update Review 2 document, add Review 3 generator and Mermaid figures, fix viva guides
</commit_message>
<xml_diff>
--- a/docs/review2-document.docx
+++ b/docs/review2-document.docx
@@ -27,7 +27,7 @@
           <w:color w:val="5A5A5A"/>
           <w:sz w:val="24"/>
         </w:rPr>
-        <w:t>Assessment 9-10 Marks</w:t>
+        <w:t>AuxFlow: Static Analysis for Multi-Pass Document Compilation</w:t>
       </w:r>
     </w:p>
     <w:p>
@@ -264,7 +264,7 @@
                 <w:b w:val="0"/>
                 <w:sz w:val="22"/>
               </w:rPr>
-              <w:t>21 October 2026</w:t>
+              <w:t>28 October 2026</w:t>
             </w:r>
           </w:p>
         </w:tc>
@@ -290,16 +290,16 @@
     </w:p>
     <w:p>
       <w:pPr>
+        <w:keepNext/>
         <w:spacing w:after="160"/>
       </w:pPr>
       <w:r>
         <w:rPr>
           <w:rFonts w:ascii="Calibri" w:hAnsi="Calibri"/>
           <w:b/>
-          <w:i w:val="0"/>
           <w:sz w:val="22"/>
         </w:rPr>
-        <w:t>Brief introduction to the project:</w:t>
+        <w:t>Introduction</w:t>
       </w:r>
     </w:p>
     <w:p>
@@ -309,10 +309,24 @@
       <w:r>
         <w:rPr>
           <w:rFonts w:ascii="Calibri" w:hAnsi="Calibri"/>
-          <w:i w:val="0"/>
+          <w:b w:val="0"/>
           <w:sz w:val="22"/>
         </w:rPr>
-        <w:t>AuxFlow is a compiler-based static analysis tool for LaTeX documents that use multi-pass compilation. It builds a dedicated compiler front end (lexer, parser, AST, symbol tables) and an intermediate representation called the Auxiliary Reference Graph (ARG), then performs graph-based dataflow analysis to classify a document's cross-reference dependency structure before any LaTeX engine runs.</w:t>
+        <w:t>AuxFlow is a static analysis tool for LaTeX documents that need more than one compilation pass. It has its own compiler front end (lexer, parser, AST, symbol tables) and an intermediate representation called the Auxiliary Reference Graph (ARG). Graph analysis over the ARG classifies the cross-reference dependency structure of a document before the LaTeX engine runs.</w:t>
+      </w:r>
+    </w:p>
+    <w:p>
+      <w:pPr>
+        <w:keepNext/>
+        <w:spacing w:after="160"/>
+      </w:pPr>
+      <w:r>
+        <w:rPr>
+          <w:rFonts w:ascii="Calibri" w:hAnsi="Calibri"/>
+          <w:b/>
+          <w:sz w:val="22"/>
+        </w:rPr>
+        <w:t>Problem</w:t>
       </w:r>
     </w:p>
     <w:p>
@@ -322,38 +336,24 @@
       <w:r>
         <w:rPr>
           <w:rFonts w:ascii="Calibri" w:hAnsi="Calibri"/>
-          <w:b/>
-          <w:i w:val="0"/>
+          <w:b w:val="0"/>
           <w:sz w:val="22"/>
         </w:rPr>
-        <w:t>Problem statement and the need for the project:</w:t>
+        <w:t>Cross-references, tables of contents, and bibliographies make LaTeX write auxiliary files that the next pass reads. A document is stable only when these files stop changing. Build tools find the pass count by trial: they run the engine until the files stop changing, or they run a fixed schedule such as three passes. A fixed schedule wastes runs on simple documents and stops too early on documents that need more. A small number of documents never stabilise because a page number controls how much content is generated. No tool we surveyed (latexmk, latexrun, Tectonic) analyses this dependency structure before it runs the engine.</w:t>
       </w:r>
     </w:p>
     <w:p>
       <w:pPr>
-        <w:spacing w:after="160"/>
-      </w:pPr>
-      <w:r>
-        <w:rPr>
-          <w:rFonts w:ascii="Calibri" w:hAnsi="Calibri"/>
-          <w:i w:val="0"/>
-          <w:sz w:val="22"/>
-        </w:rPr>
-        <w:t>LaTeX documents containing cross-references, tables of contents, bibliographies, and similar auxiliary state require multiple compilation passes to converge to a stable output. Authors currently discover the correct number of passes by trial and error, or by running a fixed schedule (e.g. always three passes) that can either waste compute on documents that converge sooner or silently under-compile documents that need more passes, including rare documents that do not converge at all (infinite page growth or page-number oscillation). No existing tool reasons about this dependency structure statically, before executing the engine.</w:t>
-      </w:r>
-    </w:p>
-    <w:p>
-      <w:pPr>
+        <w:keepNext/>
         <w:spacing w:after="160"/>
       </w:pPr>
       <w:r>
         <w:rPr>
           <w:rFonts w:ascii="Calibri" w:hAnsi="Calibri"/>
           <w:b/>
-          <w:i w:val="0"/>
           <w:sz w:val="22"/>
         </w:rPr>
-        <w:t>Objectives of the project:</w:t>
+        <w:t>Objectives</w:t>
       </w:r>
     </w:p>
     <w:p>
@@ -366,7 +366,7 @@
           <w:rFonts w:ascii="Calibri" w:hAnsi="Calibri"/>
           <w:sz w:val="22"/>
         </w:rPr>
-        <w:t>Build a complete compiler front end (lexer, parser, AST, symbol tables, semantic checks) for a declared, well-specified subset of the LaTeX language.</w:t>
+        <w:t>Build a compiler front end (lexer, parser, AST, symbol tables, semantic checks) for a declared subset of LaTeX.</w:t>
       </w:r>
     </w:p>
     <w:p>
@@ -379,7 +379,7 @@
           <w:rFonts w:ascii="Calibri" w:hAnsi="Calibri"/>
           <w:sz w:val="22"/>
         </w:rPr>
-        <w:t>Lower the resolved AST into an instance-level Intermediate Representation (the Auxiliary Reference Graph) that models cross-reference, table-of-contents, bibliography, and counter dependencies as typed, lagged graph edges.</w:t>
+        <w:t>Lower the resolved AST into the Auxiliary Reference Graph, an instance-level intermediate representation with typed, lagged dependency edges.</w:t>
       </w:r>
     </w:p>
     <w:p>
@@ -392,7 +392,7 @@
           <w:rFonts w:ascii="Calibri" w:hAnsi="Calibri"/>
           <w:sz w:val="22"/>
         </w:rPr>
-        <w:t>Apply static graph analysis (strongly connected components, taint propagation) to classify each document into one of four convergence states: CERTIFIED, BENIGN_CYCLIC, AMPLIFYING, or UNKNOWN.</w:t>
+        <w:t>Classify each document into one of four convergence states (CERTIFIED, BENIGN_CYCLIC, AMPLIFYING, UNKNOWN) with strongly connected components and taint analysis.</w:t>
       </w:r>
     </w:p>
     <w:p>
@@ -405,7 +405,7 @@
           <w:rFonts w:ascii="Calibri" w:hAnsi="Calibri"/>
           <w:sz w:val="22"/>
         </w:rPr>
-        <w:t>Derive a safe, minimal build plan (predicted engine pass count) for certified documents, and pair it with runtime verification that can confirm or correct the static prediction.</w:t>
+        <w:t>Derive a safe build plan with a predicted engine run count, and check that prediction at runtime.</w:t>
       </w:r>
     </w:p>
     <w:p>
@@ -418,7 +418,21 @@
           <w:rFonts w:ascii="Calibri" w:hAnsi="Calibri"/>
           <w:sz w:val="22"/>
         </w:rPr>
-        <w:t>Evaluate the approach empirically against a benchmark corpus and against existing shipping tools (latexmk, latexrun, Tectonic).</w:t>
+        <w:t>Measure the approach on a benchmark corpus against seven baselines and against latexmk, latexrun, Tectonic, and Typst.</w:t>
+      </w:r>
+    </w:p>
+    <w:p>
+      <w:pPr>
+        <w:keepNext/>
+        <w:spacing w:after="160"/>
+      </w:pPr>
+      <w:r>
+        <w:rPr>
+          <w:rFonts w:ascii="Calibri" w:hAnsi="Calibri"/>
+          <w:b/>
+          <w:sz w:val="22"/>
+        </w:rPr>
+        <w:t>Approach</w:t>
       </w:r>
     </w:p>
     <w:p>
@@ -428,24 +442,10 @@
       <w:r>
         <w:rPr>
           <w:rFonts w:ascii="Calibri" w:hAnsi="Calibri"/>
-          <w:b/>
-          <w:i w:val="0"/>
+          <w:b w:val="0"/>
           <w:sz w:val="22"/>
         </w:rPr>
-        <w:t>Proposed solution and its expected outcome:</w:t>
-      </w:r>
-    </w:p>
-    <w:p>
-      <w:pPr>
-        <w:spacing w:after="160"/>
-      </w:pPr>
-      <w:r>
-        <w:rPr>
-          <w:rFonts w:ascii="Calibri" w:hAnsi="Calibri"/>
-          <w:i w:val="0"/>
-          <w:sz w:val="22"/>
-        </w:rPr>
-        <w:t>AuxFlow proposes treating the LaTeX convergence problem as a compiler problem rather than a trial-and-error execution problem: parse the source once, build a dependency graph of every cross-reference-bearing construct, and decide statically whether the document's auxiliary state is guaranteed to stabilise, and in how many passes. The expected outcome is a tool that classifies a document and (when safe) predicts an exact engine-pass count in milliseconds, with zero LaTeX engine executions, while degrading conservatively (reporting UNKNOWN rather than guessing) for constructs outside its declared subset.</w:t>
+        <w:t>AuxFlow treats pass-count selection as a compiler problem. It parses the source once, builds a graph of every construct that reads or writes auxiliary state, and decides from that graph whether the auxiliary state settles and after how many runs. For a certified document the tool predicts the run count in under 10 ms with no engine execution. For constructs outside the declared subset it reports UNKNOWN and uses a conservative schedule.</w:t>
       </w:r>
     </w:p>
     <w:p>
@@ -462,15 +462,7 @@
           <w:color w:val="0D1B2A"/>
           <w:sz w:val="32"/>
         </w:rPr>
-        <w:t>3. Implementation / Prototype Progress (75/100%)</w:t>
-      </w:r>
-      <w:r>
-        <w:rPr>
-          <w:i/>
-          <w:color w:val="5A5A5A"/>
-          <w:sz w:val="22"/>
-        </w:rPr>
-        <w:t xml:space="preserve"> (5 Marks)</w:t>
+        <w:t>3. Implementation Progress</w:t>
       </w:r>
     </w:p>
     <w:p>
@@ -480,44 +472,333 @@
       <w:r>
         <w:rPr>
           <w:rFonts w:ascii="Calibri" w:hAnsi="Calibri"/>
-          <w:b/>
-          <w:i w:val="0"/>
+          <w:b w:val="0"/>
           <w:sz w:val="22"/>
         </w:rPr>
-        <w:t>Overall implementation status:</w:t>
+        <w:t>Progress: 16 of 16 implementation phases complete (100% of the implementation plan). This document covers the front end and the intermediate representation (Phases 1 to 7).</w:t>
       </w:r>
     </w:p>
+    <w:tbl>
+      <w:tblPr>
+        <w:tblStyle w:val="TableGrid"/>
+        <w:tblW w:type="auto" w:w="0"/>
+        <w:jc w:val="center"/>
+        <w:tblLook w:firstColumn="1" w:firstRow="1" w:lastColumn="0" w:lastRow="0" w:noHBand="0" w:noVBand="1" w:val="04A0"/>
+      </w:tblPr>
+      <w:tblGrid>
+        <w:gridCol w:w="3249"/>
+        <w:gridCol w:w="3249"/>
+        <w:gridCol w:w="3249"/>
+      </w:tblGrid>
+      <w:tr>
+        <w:tc>
+          <w:tcPr>
+            <w:tcW w:type="dxa" w:w="3249"/>
+            <w:shd w:val="clear" w:color="auto" w:fill="E6EDF3"/>
+          </w:tcPr>
+          <w:p>
+            <w:r/>
+            <w:r>
+              <w:rPr>
+                <w:rFonts w:ascii="Calibri" w:hAnsi="Calibri"/>
+                <w:b/>
+                <w:sz w:val="18"/>
+              </w:rPr>
+              <w:t>Phases</w:t>
+            </w:r>
+          </w:p>
+        </w:tc>
+        <w:tc>
+          <w:tcPr>
+            <w:tcW w:type="dxa" w:w="3249"/>
+            <w:shd w:val="clear" w:color="auto" w:fill="E6EDF3"/>
+          </w:tcPr>
+          <w:p>
+            <w:r/>
+            <w:r>
+              <w:rPr>
+                <w:rFonts w:ascii="Calibri" w:hAnsi="Calibri"/>
+                <w:b/>
+                <w:sz w:val="18"/>
+              </w:rPr>
+              <w:t>Scope</w:t>
+            </w:r>
+          </w:p>
+        </w:tc>
+        <w:tc>
+          <w:tcPr>
+            <w:tcW w:type="dxa" w:w="3249"/>
+            <w:shd w:val="clear" w:color="auto" w:fill="E6EDF3"/>
+          </w:tcPr>
+          <w:p>
+            <w:r/>
+            <w:r>
+              <w:rPr>
+                <w:rFonts w:ascii="Calibri" w:hAnsi="Calibri"/>
+                <w:b/>
+                <w:sz w:val="18"/>
+              </w:rPr>
+              <w:t>Status</w:t>
+            </w:r>
+          </w:p>
+        </w:tc>
+      </w:tr>
+      <w:tr>
+        <w:tc>
+          <w:tcPr>
+            <w:tcW w:type="dxa" w:w="3249"/>
+          </w:tcPr>
+          <w:p>
+            <w:r/>
+            <w:r>
+              <w:rPr>
+                <w:rFonts w:ascii="Calibri" w:hAnsi="Calibri"/>
+                <w:b w:val="0"/>
+                <w:sz w:val="18"/>
+              </w:rPr>
+              <w:t>1</w:t>
+            </w:r>
+          </w:p>
+        </w:tc>
+        <w:tc>
+          <w:tcPr>
+            <w:tcW w:type="dxa" w:w="3249"/>
+          </w:tcPr>
+          <w:p>
+            <w:r/>
+            <w:r>
+              <w:rPr>
+                <w:rFonts w:ascii="Calibri" w:hAnsi="Calibri"/>
+                <w:b w:val="0"/>
+                <w:sz w:val="18"/>
+              </w:rPr>
+              <w:t>Project setup and test infrastructure</w:t>
+            </w:r>
+          </w:p>
+        </w:tc>
+        <w:tc>
+          <w:tcPr>
+            <w:tcW w:type="dxa" w:w="3249"/>
+          </w:tcPr>
+          <w:p>
+            <w:r/>
+            <w:r>
+              <w:rPr>
+                <w:rFonts w:ascii="Calibri" w:hAnsi="Calibri"/>
+                <w:b w:val="0"/>
+                <w:sz w:val="18"/>
+              </w:rPr>
+              <w:t>Complete</w:t>
+            </w:r>
+          </w:p>
+        </w:tc>
+      </w:tr>
+      <w:tr>
+        <w:tc>
+          <w:tcPr>
+            <w:tcW w:type="dxa" w:w="3249"/>
+          </w:tcPr>
+          <w:p>
+            <w:r/>
+            <w:r>
+              <w:rPr>
+                <w:rFonts w:ascii="Calibri" w:hAnsi="Calibri"/>
+                <w:b w:val="0"/>
+                <w:sz w:val="18"/>
+              </w:rPr>
+              <w:t>2 to 7</w:t>
+            </w:r>
+          </w:p>
+        </w:tc>
+        <w:tc>
+          <w:tcPr>
+            <w:tcW w:type="dxa" w:w="3249"/>
+          </w:tcPr>
+          <w:p>
+            <w:r/>
+            <w:r>
+              <w:rPr>
+                <w:rFonts w:ascii="Calibri" w:hAnsi="Calibri"/>
+                <w:b w:val="0"/>
+                <w:sz w:val="18"/>
+              </w:rPr>
+              <w:t>Lexer, parser, AST, symbol tables, semantic checks, IR</w:t>
+            </w:r>
+          </w:p>
+        </w:tc>
+        <w:tc>
+          <w:tcPr>
+            <w:tcW w:type="dxa" w:w="3249"/>
+          </w:tcPr>
+          <w:p>
+            <w:r/>
+            <w:r>
+              <w:rPr>
+                <w:rFonts w:ascii="Calibri" w:hAnsi="Calibri"/>
+                <w:b w:val="0"/>
+                <w:sz w:val="18"/>
+              </w:rPr>
+              <w:t>Complete</w:t>
+            </w:r>
+          </w:p>
+        </w:tc>
+      </w:tr>
+      <w:tr>
+        <w:tc>
+          <w:tcPr>
+            <w:tcW w:type="dxa" w:w="3249"/>
+          </w:tcPr>
+          <w:p>
+            <w:r/>
+            <w:r>
+              <w:rPr>
+                <w:rFonts w:ascii="Calibri" w:hAnsi="Calibri"/>
+                <w:b w:val="0"/>
+                <w:sz w:val="18"/>
+              </w:rPr>
+              <w:t>8 to 11</w:t>
+            </w:r>
+          </w:p>
+        </w:tc>
+        <w:tc>
+          <w:tcPr>
+            <w:tcW w:type="dxa" w:w="3249"/>
+          </w:tcPr>
+          <w:p>
+            <w:r/>
+            <w:r>
+              <w:rPr>
+                <w:rFonts w:ascii="Calibri" w:hAnsi="Calibri"/>
+                <w:b w:val="0"/>
+                <w:sz w:val="18"/>
+              </w:rPr>
+              <w:t>SCC analysis, taint analysis, stable-pass fixpoint, classifier</w:t>
+            </w:r>
+          </w:p>
+        </w:tc>
+        <w:tc>
+          <w:tcPr>
+            <w:tcW w:type="dxa" w:w="3249"/>
+          </w:tcPr>
+          <w:p>
+            <w:r/>
+            <w:r>
+              <w:rPr>
+                <w:rFonts w:ascii="Calibri" w:hAnsi="Calibri"/>
+                <w:b w:val="0"/>
+                <w:sz w:val="18"/>
+              </w:rPr>
+              <w:t>Complete</w:t>
+            </w:r>
+          </w:p>
+        </w:tc>
+      </w:tr>
+      <w:tr>
+        <w:tc>
+          <w:tcPr>
+            <w:tcW w:type="dxa" w:w="3249"/>
+          </w:tcPr>
+          <w:p>
+            <w:r/>
+            <w:r>
+              <w:rPr>
+                <w:rFonts w:ascii="Calibri" w:hAnsi="Calibri"/>
+                <w:b w:val="0"/>
+                <w:sz w:val="18"/>
+              </w:rPr>
+              <w:t>12 to 13</w:t>
+            </w:r>
+          </w:p>
+        </w:tc>
+        <w:tc>
+          <w:tcPr>
+            <w:tcW w:type="dxa" w:w="3249"/>
+          </w:tcPr>
+          <w:p>
+            <w:r/>
+            <w:r>
+              <w:rPr>
+                <w:rFonts w:ascii="Calibri" w:hAnsi="Calibri"/>
+                <w:b w:val="0"/>
+                <w:sz w:val="18"/>
+              </w:rPr>
+              <w:t>Build planner, runtime verification</w:t>
+            </w:r>
+          </w:p>
+        </w:tc>
+        <w:tc>
+          <w:tcPr>
+            <w:tcW w:type="dxa" w:w="3249"/>
+          </w:tcPr>
+          <w:p>
+            <w:r/>
+            <w:r>
+              <w:rPr>
+                <w:rFonts w:ascii="Calibri" w:hAnsi="Calibri"/>
+                <w:b w:val="0"/>
+                <w:sz w:val="18"/>
+              </w:rPr>
+              <w:t>Complete</w:t>
+            </w:r>
+          </w:p>
+        </w:tc>
+      </w:tr>
+      <w:tr>
+        <w:tc>
+          <w:tcPr>
+            <w:tcW w:type="dxa" w:w="3249"/>
+          </w:tcPr>
+          <w:p>
+            <w:r/>
+            <w:r>
+              <w:rPr>
+                <w:rFonts w:ascii="Calibri" w:hAnsi="Calibri"/>
+                <w:b w:val="0"/>
+                <w:sz w:val="18"/>
+              </w:rPr>
+              <w:t>14 to 16</w:t>
+            </w:r>
+          </w:p>
+        </w:tc>
+        <w:tc>
+          <w:tcPr>
+            <w:tcW w:type="dxa" w:w="3249"/>
+          </w:tcPr>
+          <w:p>
+            <w:r/>
+            <w:r>
+              <w:rPr>
+                <w:rFonts w:ascii="Calibri" w:hAnsi="Calibri"/>
+                <w:b w:val="0"/>
+                <w:sz w:val="18"/>
+              </w:rPr>
+              <w:t>Benchmark corpus, harness, evaluation report</w:t>
+            </w:r>
+          </w:p>
+        </w:tc>
+        <w:tc>
+          <w:tcPr>
+            <w:tcW w:type="dxa" w:w="3249"/>
+          </w:tcPr>
+          <w:p>
+            <w:r/>
+            <w:r>
+              <w:rPr>
+                <w:rFonts w:ascii="Calibri" w:hAnsi="Calibri"/>
+                <w:b w:val="0"/>
+                <w:sz w:val="18"/>
+              </w:rPr>
+              <w:t>Complete</w:t>
+            </w:r>
+          </w:p>
+        </w:tc>
+      </w:tr>
+    </w:tbl>
+    <w:p/>
     <w:p>
       <w:pPr>
+        <w:keepNext/>
         <w:spacing w:after="160"/>
-      </w:pPr>
-      <w:r>
-        <w:rPr>
-          <w:rFonts w:ascii="Calibri" w:hAnsi="Calibri"/>
-          <w:i w:val="0"/>
-          <w:sz w:val="22"/>
-        </w:rPr>
-        <w:t>As of Review 2, Phases 1 through 7 of the 16-phase implementation plan are complete and verified: the full compiler front end (lexical analysis, parsing, AST construction, symbol tables, semantic analysis) and the Intermediate Representation (the Auxiliary Reference Graph) are implemented, tested, and committed. This is approximately 44% of the total phase count and covers the entire input-to-IR pipeline that every later analysis phase depends on. The remaining phases (graph analysis, classification, build planning, runtime verification, and empirical evaluation) are scoped for Review 3.</w:t>
-      </w:r>
-    </w:p>
-    <w:p>
-      <w:pPr>
-        <w:spacing w:after="160"/>
-      </w:pPr>
-      <w:r>
-        <w:rPr>
-          <w:rFonts w:ascii="Calibri" w:hAnsi="Calibri"/>
-          <w:b/>
-          <w:i w:val="0"/>
-          <w:sz w:val="22"/>
-        </w:rPr>
-        <w:t>Modules completed and their functionalities:</w:t>
-      </w:r>
-    </w:p>
-    <w:p>
-      <w:pPr>
-        <w:pStyle w:val="ListBullet"/>
-        <w:spacing w:after="80"/>
       </w:pPr>
       <w:r>
         <w:rPr>
@@ -525,286 +806,7 @@
           <w:b/>
           <w:sz w:val="22"/>
         </w:rPr>
-        <w:t xml:space="preserve">Lexer (auxflow.lexer): </w:t>
-      </w:r>
-      <w:r>
-        <w:rPr>
-          <w:rFonts w:ascii="Calibri" w:hAnsi="Calibri"/>
-          <w:sz w:val="22"/>
-        </w:rPr>
-        <w:t>Single-pass, table-driven scanner implementing all sixteen TeX category codes (catcodes). Recognises comments, escape sequences, control words/symbols, and delimiter-driven \verb verbatim regions. Verified with a token round-trip property test (reconstructed tokens reproduce the exact source bytes).</w:t>
-      </w:r>
-    </w:p>
-    <w:p>
-      <w:pPr>
-        <w:pStyle w:val="ListBullet"/>
-        <w:spacing w:after="80"/>
-      </w:pPr>
-      <w:r>
-        <w:rPr>
-          <w:rFonts w:ascii="Calibri" w:hAnsi="Calibri"/>
-          <w:b/>
-          <w:sz w:val="22"/>
-        </w:rPr>
-        <w:t xml:space="preserve">Parser (auxflow.parser): </w:t>
-      </w:r>
-      <w:r>
-        <w:rPr>
-          <w:rFonts w:ascii="Calibri" w:hAnsi="Calibri"/>
-          <w:sz w:val="22"/>
-        </w:rPr>
-        <w:t>Hand-written recursive-descent parser with one token of lookahead. Argument parsing (mandatory/optional groups) is driven by a declared macro-signature table. Produces one AST per file over sixteen node kinds, each carrying a mandatory source span. Malformed input (unterminated groups, missing arguments) is recorded as a diagnostic rather than raising an exception, so the parser never crashes on real-world input.</w:t>
-      </w:r>
-    </w:p>
-    <w:p>
-      <w:pPr>
-        <w:pStyle w:val="ListBullet"/>
-        <w:spacing w:after="80"/>
-      </w:pPr>
-      <w:r>
-        <w:rPr>
-          <w:rFonts w:ascii="Calibri" w:hAnsi="Calibri"/>
-          <w:b/>
-          <w:sz w:val="22"/>
-        </w:rPr>
-        <w:t xml:space="preserve">AST and inclusion resolution (auxflow.ast): </w:t>
-      </w:r>
-      <w:r>
-        <w:rPr>
-          <w:rFonts w:ascii="Calibri" w:hAnsi="Calibri"/>
-          <w:sz w:val="22"/>
-        </w:rPr>
-        <w:t>Assembles per-file ASTs into a multi-file forest and builds the file-inclusion graph from \input/\include edges, with depth-first-search cycle detection for circular inclusion.</w:t>
-      </w:r>
-    </w:p>
-    <w:p>
-      <w:pPr>
-        <w:pStyle w:val="ListBullet"/>
-        <w:spacing w:after="80"/>
-      </w:pPr>
-      <w:r>
-        <w:rPr>
-          <w:rFonts w:ascii="Calibri" w:hAnsi="Calibri"/>
-          <w:b/>
-          <w:sz w:val="22"/>
-        </w:rPr>
-        <w:t xml:space="preserve">Symbol tables (auxflow.semantic): </w:t>
-      </w:r>
-      <w:r>
-        <w:rPr>
-          <w:rFonts w:ascii="Calibri" w:hAnsi="Calibri"/>
-          <w:sz w:val="22"/>
-        </w:rPr>
-        <w:t>Six symbol tables (LabelTable, RefTable, CiteTable, PackageTable, FileTable, CounterTable) populated by a two-pass declare-then-resolve traversal, so forward references and cross-file references both resolve correctly.</w:t>
-      </w:r>
-    </w:p>
-    <w:p>
-      <w:pPr>
-        <w:pStyle w:val="ListBullet"/>
-        <w:spacing w:after="80"/>
-      </w:pPr>
-      <w:r>
-        <w:rPr>
-          <w:rFonts w:ascii="Calibri" w:hAnsi="Calibri"/>
-          <w:b/>
-          <w:sz w:val="22"/>
-        </w:rPr>
-        <w:t xml:space="preserve">Semantic analysis (auxflow.semantic.diagnostics): </w:t>
-      </w:r>
-      <w:r>
-        <w:rPr>
-          <w:rFonts w:ascii="Calibri" w:hAnsi="Calibri"/>
-          <w:sz w:val="22"/>
-        </w:rPr>
-        <w:t>Zero-engine-execution checks: undefined references, undefined citations, duplicate labels, unresolvable file inclusions, missing graphics files, inclusion cycles, and use of an unmodelled (opaque) package.</w:t>
-      </w:r>
-    </w:p>
-    <w:p>
-      <w:pPr>
-        <w:pStyle w:val="ListBullet"/>
-        <w:spacing w:after="80"/>
-      </w:pPr>
-      <w:r>
-        <w:rPr>
-          <w:rFonts w:ascii="Calibri" w:hAnsi="Calibri"/>
-          <w:b/>
-          <w:sz w:val="22"/>
-        </w:rPr>
-        <w:t xml:space="preserve">Intermediate Representation (auxflow.ir): </w:t>
-      </w:r>
-      <w:r>
-        <w:rPr>
-          <w:rFonts w:ascii="Calibri" w:hAnsi="Calibri"/>
-          <w:sz w:val="22"/>
-        </w:rPr>
-        <w:t>The Auxiliary Reference Graph (ARG): one fact instance per modelled construct (label, reference, table-of-contents entry, citation, counter read), each with a mandatory source span, connected by typed, lagged dependency edges. List-producing facts use an exists/value split so that ordinary documents remain acyclic by construction. Serialises to JSON and to Graphviz DOT.</w:t>
-      </w:r>
-    </w:p>
-    <w:p>
-      <w:pPr>
-        <w:pStyle w:val="ListBullet"/>
-        <w:spacing w:after="80"/>
-      </w:pPr>
-      <w:r>
-        <w:rPr>
-          <w:rFonts w:ascii="Calibri" w:hAnsi="Calibri"/>
-          <w:b/>
-          <w:sz w:val="22"/>
-        </w:rPr>
-        <w:t xml:space="preserve">Command-line interface (auxflow.cli): </w:t>
-      </w:r>
-      <w:r>
-        <w:rPr>
-          <w:rFonts w:ascii="Calibri" w:hAnsi="Calibri"/>
-          <w:sz w:val="22"/>
-        </w:rPr>
-        <w:t>Five working subcommands exposing every completed phase: auxflow tokens, auxflow ast, auxflow symbols, auxflow check, auxflow graph.</w:t>
-      </w:r>
-    </w:p>
-    <w:p>
-      <w:pPr>
-        <w:spacing w:after="160"/>
-      </w:pPr>
-      <w:r>
-        <w:rPr>
-          <w:rFonts w:ascii="Calibri" w:hAnsi="Calibri"/>
-          <w:b/>
-          <w:i w:val="0"/>
-          <w:sz w:val="22"/>
-        </w:rPr>
-        <w:t>Technologies, tools, programming languages, and platforms used:</w:t>
-      </w:r>
-    </w:p>
-    <w:p>
-      <w:pPr>
-        <w:pStyle w:val="ListBullet"/>
-        <w:spacing w:after="80"/>
-      </w:pPr>
-      <w:r>
-        <w:rPr>
-          <w:rFonts w:ascii="Calibri" w:hAnsi="Calibri"/>
-          <w:sz w:val="22"/>
-        </w:rPr>
-        <w:t>Language: Python 3.12+ (tested through 3.14), strict static typing enforced with mypy.</w:t>
-      </w:r>
-    </w:p>
-    <w:p>
-      <w:pPr>
-        <w:pStyle w:val="ListBullet"/>
-        <w:spacing w:after="80"/>
-      </w:pPr>
-      <w:r>
-        <w:rPr>
-          <w:rFonts w:ascii="Calibri" w:hAnsi="Calibri"/>
-          <w:sz w:val="22"/>
-        </w:rPr>
-        <w:t>Core implementation: zero third-party runtime dependencies. The lexer, parser, symbol tables, and IR are entirely hand-written, including the eventual Tarjan strongly connected components algorithm used in later phases.</w:t>
-      </w:r>
-    </w:p>
-    <w:p>
-      <w:pPr>
-        <w:pStyle w:val="ListBullet"/>
-        <w:spacing w:after="80"/>
-      </w:pPr>
-      <w:r>
-        <w:rPr>
-          <w:rFonts w:ascii="Calibri" w:hAnsi="Calibri"/>
-          <w:sz w:val="22"/>
-        </w:rPr>
-        <w:t>Testing: pytest with property-based testing via Hypothesis for round-trip and structural invariants.</w:t>
-      </w:r>
-    </w:p>
-    <w:p>
-      <w:pPr>
-        <w:pStyle w:val="ListBullet"/>
-        <w:spacing w:after="80"/>
-      </w:pPr>
-      <w:r>
-        <w:rPr>
-          <w:rFonts w:ascii="Calibri" w:hAnsi="Calibri"/>
-          <w:sz w:val="22"/>
-        </w:rPr>
-        <w:t>Code quality: ruff (linting and formatting), mypy --strict (type checking).</w:t>
-      </w:r>
-    </w:p>
-    <w:p>
-      <w:pPr>
-        <w:pStyle w:val="ListBullet"/>
-        <w:spacing w:after="80"/>
-      </w:pPr>
-      <w:r>
-        <w:rPr>
-          <w:rFonts w:ascii="Calibri" w:hAnsi="Calibri"/>
-          <w:sz w:val="22"/>
-        </w:rPr>
-        <w:t>Version control and CI: Git and GitHub, with GitHub Actions running lint, format-check, type-check, and the full test suite on every change.</w:t>
-      </w:r>
-    </w:p>
-    <w:p>
-      <w:pPr>
-        <w:pStyle w:val="ListBullet"/>
-        <w:spacing w:after="80"/>
-      </w:pPr>
-      <w:r>
-        <w:rPr>
-          <w:rFonts w:ascii="Calibri" w:hAnsi="Calibri"/>
-          <w:sz w:val="22"/>
-        </w:rPr>
-        <w:t>Target input language: a declared, documented subset of LaTeX2e.</w:t>
-      </w:r>
-    </w:p>
-    <w:p>
-      <w:pPr>
-        <w:spacing w:after="160"/>
-      </w:pPr>
-      <w:r>
-        <w:rPr>
-          <w:rFonts w:ascii="Calibri" w:hAnsi="Calibri"/>
-          <w:b/>
-          <w:i w:val="0"/>
-          <w:sz w:val="22"/>
-        </w:rPr>
-        <w:t>System architecture / workflow:</w:t>
-      </w:r>
-    </w:p>
-    <w:p>
-      <w:pPr>
-        <w:spacing w:after="160"/>
-      </w:pPr>
-      <w:r>
-        <w:rPr>
-          <w:rFonts w:ascii="Calibri" w:hAnsi="Calibri"/>
-          <w:i w:val="0"/>
-          <w:sz w:val="22"/>
-        </w:rPr>
-        <w:t>The implemented pipeline (Phases 1-7, left to right): Source bytes  --&gt;  Lexer (catcode-aware tokens)  --&gt;  Parser (recursive descent)  --&gt;  AST (per file)  --&gt;  Multi-file Forest (inclusion graph)  --&gt;  Symbol Tables (declare, then resolve)  --&gt;  Semantic Diagnostics (zero-engine checks)  --&gt;  IR Lowering  --&gt;  Auxiliary Reference Graph (the Intermediate Representation). Every stage up to and including the IR runs with no LaTeX engine installed. Phases 8-16 (not yet started) will consume this ARG for graph analysis, classification, build planning, and runtime verification.</w:t>
-      </w:r>
-    </w:p>
-    <w:p>
-      <w:pPr>
-        <w:spacing w:after="160"/>
-      </w:pPr>
-      <w:r>
-        <w:rPr>
-          <w:rFonts w:ascii="Calibri" w:hAnsi="Calibri"/>
-          <w:b/>
-          <w:i w:val="0"/>
-          <w:sz w:val="22"/>
-        </w:rPr>
-        <w:t>Screenshots of the implemented modules or prototype:</w:t>
-      </w:r>
-    </w:p>
-    <w:p>
-      <w:pPr>
-        <w:spacing w:after="160"/>
-      </w:pPr>
-      <w:r>
-        <w:rPr>
-          <w:rFonts w:ascii="Calibri" w:hAnsi="Calibri"/>
-          <w:i w:val="0"/>
-          <w:sz w:val="22"/>
-        </w:rPr>
-        <w:t>Captured from real `auxflow` runs against the project's own benchmark corpus (bench/corpus/). Each image shows the exact command and its unedited output.</w:t>
+        <w:t>System architecture</w:t>
       </w:r>
     </w:p>
     <w:p>
@@ -814,7 +816,7 @@
       <w:r>
         <w:drawing>
           <wp:inline xmlns:a="http://schemas.openxmlformats.org/drawingml/2006/main" xmlns:pic="http://schemas.openxmlformats.org/drawingml/2006/picture">
-            <wp:extent cx="5580000" cy="2027020"/>
+            <wp:extent cx="5580000" cy="5729280"/>
             <wp:docPr id="1" name="Picture 1"/>
             <wp:cNvGraphicFramePr>
               <a:graphicFrameLocks noChangeAspect="1"/>
@@ -823,7 +825,7 @@
               <a:graphicData uri="http://schemas.openxmlformats.org/drawingml/2006/picture">
                 <pic:pic>
                   <pic:nvPicPr>
-                    <pic:cNvPr id="0" name="01-tokens.png"/>
+                    <pic:cNvPr id="0" name="architecture.png"/>
                     <pic:cNvPicPr/>
                   </pic:nvPicPr>
                   <pic:blipFill>
@@ -835,7 +837,7 @@
                   <pic:spPr>
                     <a:xfrm>
                       <a:off x="0" y="0"/>
-                      <a:ext cx="5580000" cy="2027020"/>
+                      <a:ext cx="5580000" cy="5729280"/>
                     </a:xfrm>
                     <a:prstGeom prst="rect"/>
                   </pic:spPr>
@@ -857,7 +859,7 @@
           <w:color w:val="5A5A5A"/>
           <w:sz w:val="20"/>
         </w:rPr>
-        <w:t>Phase 2, Lexical Analysis: auxflow tokens</w:t>
+        <w:t>Figure 1. AuxFlow compiler pipeline. Phases 1 to 7 are the subject of this document.</w:t>
       </w:r>
     </w:p>
     <w:p>
@@ -867,7 +869,7 @@
       <w:r>
         <w:drawing>
           <wp:inline xmlns:a="http://schemas.openxmlformats.org/drawingml/2006/main" xmlns:pic="http://schemas.openxmlformats.org/drawingml/2006/picture">
-            <wp:extent cx="5580000" cy="2027020"/>
+            <wp:extent cx="5580000" cy="2856919"/>
             <wp:docPr id="2" name="Picture 2"/>
             <wp:cNvGraphicFramePr>
               <a:graphicFrameLocks noChangeAspect="1"/>
@@ -876,7 +878,7 @@
               <a:graphicData uri="http://schemas.openxmlformats.org/drawingml/2006/picture">
                 <pic:pic>
                   <pic:nvPicPr>
-                    <pic:cNvPr id="0" name="02-ast.png"/>
+                    <pic:cNvPr id="0" name="arg-b08.png"/>
                     <pic:cNvPicPr/>
                   </pic:nvPicPr>
                   <pic:blipFill>
@@ -888,7 +890,7 @@
                   <pic:spPr>
                     <a:xfrm>
                       <a:off x="0" y="0"/>
-                      <a:ext cx="5580000" cy="2027020"/>
+                      <a:ext cx="5580000" cy="2856919"/>
                     </a:xfrm>
                     <a:prstGeom prst="rect"/>
                   </pic:spPr>
@@ -910,7 +912,287 @@
           <w:color w:val="5A5A5A"/>
           <w:sz w:val="20"/>
         </w:rPr>
-        <w:t>Phase 3-4, Parsing and AST: auxflow ast</w:t>
+        <w:t>Figure 2. Auxiliary Reference Graph of b08_cycle (auxflow graph). Taint analysis adds the dashed STRUCTURAL edges. The thick one closes the AMPLIFYING cycle.</w:t>
+      </w:r>
+    </w:p>
+    <w:p>
+      <w:pPr>
+        <w:keepNext/>
+        <w:spacing w:after="160"/>
+      </w:pPr>
+      <w:r>
+        <w:rPr>
+          <w:rFonts w:ascii="Calibri" w:hAnsi="Calibri"/>
+          <w:b/>
+          <w:sz w:val="22"/>
+        </w:rPr>
+        <w:t>Implemented modules (Phases 1 to 7)</w:t>
+      </w:r>
+    </w:p>
+    <w:p>
+      <w:pPr>
+        <w:pStyle w:val="ListBullet"/>
+        <w:spacing w:after="80"/>
+      </w:pPr>
+      <w:r>
+        <w:rPr>
+          <w:rFonts w:ascii="Calibri" w:hAnsi="Calibri"/>
+          <w:b/>
+          <w:sz w:val="22"/>
+        </w:rPr>
+        <w:t xml:space="preserve">Lexer (auxflow.lexer): </w:t>
+      </w:r>
+      <w:r>
+        <w:rPr>
+          <w:rFonts w:ascii="Calibri" w:hAnsi="Calibri"/>
+          <w:sz w:val="22"/>
+        </w:rPr>
+        <w:t>Single-pass, table-driven scanner for the sixteen TeX category codes. It recognises comments, control words and symbols, and \verb verbatim regions. A property test checks that the tokens reproduce the exact source bytes.</w:t>
+      </w:r>
+    </w:p>
+    <w:p>
+      <w:pPr>
+        <w:pStyle w:val="ListBullet"/>
+        <w:spacing w:after="80"/>
+      </w:pPr>
+      <w:r>
+        <w:rPr>
+          <w:rFonts w:ascii="Calibri" w:hAnsi="Calibri"/>
+          <w:b/>
+          <w:sz w:val="22"/>
+        </w:rPr>
+        <w:t xml:space="preserve">Parser (auxflow.parser): </w:t>
+      </w:r>
+      <w:r>
+        <w:rPr>
+          <w:rFonts w:ascii="Calibri" w:hAnsi="Calibri"/>
+          <w:sz w:val="22"/>
+        </w:rPr>
+        <w:t>Hand-written recursive-descent parser with one token of lookahead. A macro-signature table drives mandatory and optional argument parsing. The parser produces one AST per file over sixteen node kinds, and every node has a source span. Malformed input, such as an unterminated group, becomes a diagnostic and does not raise an exception.</w:t>
+      </w:r>
+    </w:p>
+    <w:p>
+      <w:pPr>
+        <w:pStyle w:val="ListBullet"/>
+        <w:spacing w:after="80"/>
+      </w:pPr>
+      <w:r>
+        <w:rPr>
+          <w:rFonts w:ascii="Calibri" w:hAnsi="Calibri"/>
+          <w:b/>
+          <w:sz w:val="22"/>
+        </w:rPr>
+        <w:t xml:space="preserve">AST and inclusion resolution (auxflow.ast): </w:t>
+      </w:r>
+      <w:r>
+        <w:rPr>
+          <w:rFonts w:ascii="Calibri" w:hAnsi="Calibri"/>
+          <w:sz w:val="22"/>
+        </w:rPr>
+        <w:t>Joins the per-file ASTs into a multi-file forest and builds the inclusion graph from \input and \include. Depth-first search detects circular inclusion and files that the entry file cannot reach.</w:t>
+      </w:r>
+    </w:p>
+    <w:p>
+      <w:pPr>
+        <w:pStyle w:val="ListBullet"/>
+        <w:spacing w:after="80"/>
+      </w:pPr>
+      <w:r>
+        <w:rPr>
+          <w:rFonts w:ascii="Calibri" w:hAnsi="Calibri"/>
+          <w:b/>
+          <w:sz w:val="22"/>
+        </w:rPr>
+        <w:t xml:space="preserve">Symbol tables (auxflow.semantic): </w:t>
+      </w:r>
+      <w:r>
+        <w:rPr>
+          <w:rFonts w:ascii="Calibri" w:hAnsi="Calibri"/>
+          <w:sz w:val="22"/>
+        </w:rPr>
+        <w:t>Six tables (LabelTable, RefTable, CiteTable, PackageTable, FileTable, CounterTable). A declare pass records every definition, then a resolve pass binds the uses, so forward and cross-file references resolve.</w:t>
+      </w:r>
+    </w:p>
+    <w:p>
+      <w:pPr>
+        <w:pStyle w:val="ListBullet"/>
+        <w:spacing w:after="80"/>
+      </w:pPr>
+      <w:r>
+        <w:rPr>
+          <w:rFonts w:ascii="Calibri" w:hAnsi="Calibri"/>
+          <w:b/>
+          <w:sz w:val="22"/>
+        </w:rPr>
+        <w:t xml:space="preserve">Semantic analysis (auxflow.semantic): </w:t>
+      </w:r>
+      <w:r>
+        <w:rPr>
+          <w:rFonts w:ascii="Calibri" w:hAnsi="Calibri"/>
+          <w:sz w:val="22"/>
+        </w:rPr>
+        <w:t>Checks that need no engine run: undefined references and citations, duplicate labels, missing included files, missing graphics files, inclusion cycles, and unmodelled packages.</w:t>
+      </w:r>
+    </w:p>
+    <w:p>
+      <w:pPr>
+        <w:pStyle w:val="ListBullet"/>
+        <w:spacing w:after="80"/>
+      </w:pPr>
+      <w:r>
+        <w:rPr>
+          <w:rFonts w:ascii="Calibri" w:hAnsi="Calibri"/>
+          <w:b/>
+          <w:sz w:val="22"/>
+        </w:rPr>
+        <w:t xml:space="preserve">Intermediate representation (auxflow.ir): </w:t>
+      </w:r>
+      <w:r>
+        <w:rPr>
+          <w:rFonts w:ascii="Calibri" w:hAnsi="Calibri"/>
+          <w:sz w:val="22"/>
+        </w:rPr>
+        <w:t>The ARG has one fact per modelled construct (label, reference, contents entry, citation, counter read) with a source span. Typed edges (AUX_ROUNDTRIP, TOOL, LAYOUT, STRUCTURAL) carry a pass lag. Each list entry is split into an exists fact and a value fact, so a document with only a table of contents stays acyclic. The graph serialises to JSON and Graphviz DOT.</w:t>
+      </w:r>
+    </w:p>
+    <w:p>
+      <w:pPr>
+        <w:pStyle w:val="ListBullet"/>
+        <w:spacing w:after="80"/>
+      </w:pPr>
+      <w:r>
+        <w:rPr>
+          <w:rFonts w:ascii="Calibri" w:hAnsi="Calibri"/>
+          <w:b/>
+          <w:sz w:val="22"/>
+        </w:rPr>
+        <w:t xml:space="preserve">Command-line interface (auxflow.cli): </w:t>
+      </w:r>
+      <w:r>
+        <w:rPr>
+          <w:rFonts w:ascii="Calibri" w:hAnsi="Calibri"/>
+          <w:sz w:val="22"/>
+        </w:rPr>
+        <w:t>auxflow tokens, ast, symbols, check, and graph expose Phases 2 to 7. The same CLI also has classify, plan, and run for the Review 3 phases.</w:t>
+      </w:r>
+    </w:p>
+    <w:p>
+      <w:pPr>
+        <w:keepNext/>
+        <w:spacing w:after="160"/>
+      </w:pPr>
+      <w:r>
+        <w:rPr>
+          <w:rFonts w:ascii="Calibri" w:hAnsi="Calibri"/>
+          <w:b/>
+          <w:sz w:val="22"/>
+        </w:rPr>
+        <w:t>Technologies</w:t>
+      </w:r>
+    </w:p>
+    <w:p>
+      <w:pPr>
+        <w:pStyle w:val="ListBullet"/>
+        <w:spacing w:after="80"/>
+      </w:pPr>
+      <w:r>
+        <w:rPr>
+          <w:rFonts w:ascii="Calibri" w:hAnsi="Calibri"/>
+          <w:sz w:val="22"/>
+        </w:rPr>
+        <w:t>Python 3.12 or later. CI tests 3.12 and 3.13, and the suite also passes on 3.14.</w:t>
+      </w:r>
+    </w:p>
+    <w:p>
+      <w:pPr>
+        <w:pStyle w:val="ListBullet"/>
+        <w:spacing w:after="80"/>
+      </w:pPr>
+      <w:r>
+        <w:rPr>
+          <w:rFonts w:ascii="Calibri" w:hAnsi="Calibri"/>
+          <w:sz w:val="22"/>
+        </w:rPr>
+        <w:t>No third-party runtime dependencies. The lexer, parser, symbol tables, IR, and the Tarjan SCC algorithm are written by hand.</w:t>
+      </w:r>
+    </w:p>
+    <w:p>
+      <w:pPr>
+        <w:pStyle w:val="ListBullet"/>
+        <w:spacing w:after="80"/>
+      </w:pPr>
+      <w:r>
+        <w:rPr>
+          <w:rFonts w:ascii="Calibri" w:hAnsi="Calibri"/>
+          <w:sz w:val="22"/>
+        </w:rPr>
+        <w:t>pytest and Hypothesis for unit, property, golden, and end-to-end tests.</w:t>
+      </w:r>
+    </w:p>
+    <w:p>
+      <w:pPr>
+        <w:pStyle w:val="ListBullet"/>
+        <w:spacing w:after="80"/>
+      </w:pPr>
+      <w:r>
+        <w:rPr>
+          <w:rFonts w:ascii="Calibri" w:hAnsi="Calibri"/>
+          <w:sz w:val="22"/>
+        </w:rPr>
+        <w:t>mypy in strict mode for type checking, and ruff for linting and formatting.</w:t>
+      </w:r>
+    </w:p>
+    <w:p>
+      <w:pPr>
+        <w:pStyle w:val="ListBullet"/>
+        <w:spacing w:after="80"/>
+      </w:pPr>
+      <w:r>
+        <w:rPr>
+          <w:rFonts w:ascii="Calibri" w:hAnsi="Calibri"/>
+          <w:sz w:val="22"/>
+        </w:rPr>
+        <w:t>Docker for the benchmark: a pinned image with TeX Live, latexmk, latexrun, Tectonic, and Typst.</w:t>
+      </w:r>
+    </w:p>
+    <w:p>
+      <w:pPr>
+        <w:pStyle w:val="ListBullet"/>
+        <w:spacing w:after="80"/>
+      </w:pPr>
+      <w:r>
+        <w:rPr>
+          <w:rFonts w:ascii="Calibri" w:hAnsi="Calibri"/>
+          <w:sz w:val="22"/>
+        </w:rPr>
+        <w:t>Input language: a documented subset of LaTeX2e.</w:t>
+      </w:r>
+    </w:p>
+    <w:p>
+      <w:pPr>
+        <w:keepNext/>
+        <w:spacing w:after="160"/>
+      </w:pPr>
+      <w:r>
+        <w:rPr>
+          <w:rFonts w:ascii="Calibri" w:hAnsi="Calibri"/>
+          <w:b/>
+          <w:sz w:val="22"/>
+        </w:rPr>
+        <w:t>Screenshots</w:t>
+      </w:r>
+    </w:p>
+    <w:p>
+      <w:pPr>
+        <w:spacing w:after="160"/>
+      </w:pPr>
+      <w:r>
+        <w:rPr>
+          <w:rFonts w:ascii="Calibri" w:hAnsi="Calibri"/>
+          <w:b w:val="0"/>
+          <w:sz w:val="22"/>
+        </w:rPr>
+        <w:t>Each image shows a real auxflow command and its output on small test documents.</w:t>
       </w:r>
     </w:p>
     <w:p>
@@ -929,7 +1211,7 @@
               <a:graphicData uri="http://schemas.openxmlformats.org/drawingml/2006/picture">
                 <pic:pic>
                   <pic:nvPicPr>
-                    <pic:cNvPr id="0" name="03-symbols.png"/>
+                    <pic:cNvPr id="0" name="01-tokens.png"/>
                     <pic:cNvPicPr/>
                   </pic:nvPicPr>
                   <pic:blipFill>
@@ -963,7 +1245,113 @@
           <w:color w:val="5A5A5A"/>
           <w:sz w:val="20"/>
         </w:rPr>
-        <w:t>Phase 5, Symbol Tables: auxflow symbols</w:t>
+        <w:t>Phase 2, lexical analysis: auxflow tokens</w:t>
+      </w:r>
+    </w:p>
+    <w:p>
+      <w:pPr>
+        <w:jc w:val="center"/>
+      </w:pPr>
+      <w:r>
+        <w:drawing>
+          <wp:inline xmlns:a="http://schemas.openxmlformats.org/drawingml/2006/main" xmlns:pic="http://schemas.openxmlformats.org/drawingml/2006/picture">
+            <wp:extent cx="5580000" cy="2027020"/>
+            <wp:docPr id="4" name="Picture 4"/>
+            <wp:cNvGraphicFramePr>
+              <a:graphicFrameLocks noChangeAspect="1"/>
+            </wp:cNvGraphicFramePr>
+            <a:graphic>
+              <a:graphicData uri="http://schemas.openxmlformats.org/drawingml/2006/picture">
+                <pic:pic>
+                  <pic:nvPicPr>
+                    <pic:cNvPr id="0" name="02-ast.png"/>
+                    <pic:cNvPicPr/>
+                  </pic:nvPicPr>
+                  <pic:blipFill>
+                    <a:blip r:embed="rId12"/>
+                    <a:stretch>
+                      <a:fillRect/>
+                    </a:stretch>
+                  </pic:blipFill>
+                  <pic:spPr>
+                    <a:xfrm>
+                      <a:off x="0" y="0"/>
+                      <a:ext cx="5580000" cy="2027020"/>
+                    </a:xfrm>
+                    <a:prstGeom prst="rect"/>
+                  </pic:spPr>
+                </pic:pic>
+              </a:graphicData>
+            </a:graphic>
+          </wp:inline>
+        </w:drawing>
+      </w:r>
+    </w:p>
+    <w:p>
+      <w:pPr>
+        <w:spacing w:after="200"/>
+        <w:jc w:val="center"/>
+      </w:pPr>
+      <w:r>
+        <w:rPr>
+          <w:i/>
+          <w:color w:val="5A5A5A"/>
+          <w:sz w:val="20"/>
+        </w:rPr>
+        <w:t>Phases 3 and 4, parsing and AST: auxflow ast</w:t>
+      </w:r>
+    </w:p>
+    <w:p>
+      <w:pPr>
+        <w:jc w:val="center"/>
+      </w:pPr>
+      <w:r>
+        <w:drawing>
+          <wp:inline xmlns:a="http://schemas.openxmlformats.org/drawingml/2006/main" xmlns:pic="http://schemas.openxmlformats.org/drawingml/2006/picture">
+            <wp:extent cx="5580000" cy="2027020"/>
+            <wp:docPr id="5" name="Picture 5"/>
+            <wp:cNvGraphicFramePr>
+              <a:graphicFrameLocks noChangeAspect="1"/>
+            </wp:cNvGraphicFramePr>
+            <a:graphic>
+              <a:graphicData uri="http://schemas.openxmlformats.org/drawingml/2006/picture">
+                <pic:pic>
+                  <pic:nvPicPr>
+                    <pic:cNvPr id="0" name="03-symbols.png"/>
+                    <pic:cNvPicPr/>
+                  </pic:nvPicPr>
+                  <pic:blipFill>
+                    <a:blip r:embed="rId13"/>
+                    <a:stretch>
+                      <a:fillRect/>
+                    </a:stretch>
+                  </pic:blipFill>
+                  <pic:spPr>
+                    <a:xfrm>
+                      <a:off x="0" y="0"/>
+                      <a:ext cx="5580000" cy="2027020"/>
+                    </a:xfrm>
+                    <a:prstGeom prst="rect"/>
+                  </pic:spPr>
+                </pic:pic>
+              </a:graphicData>
+            </a:graphic>
+          </wp:inline>
+        </w:drawing>
+      </w:r>
+    </w:p>
+    <w:p>
+      <w:pPr>
+        <w:spacing w:after="200"/>
+        <w:jc w:val="center"/>
+      </w:pPr>
+      <w:r>
+        <w:rPr>
+          <w:i/>
+          <w:color w:val="5A5A5A"/>
+          <w:sz w:val="20"/>
+        </w:rPr>
+        <w:t>Phase 5, symbol tables: auxflow symbols</w:t>
       </w:r>
     </w:p>
     <w:p>
@@ -974,7 +1362,7 @@
         <w:drawing>
           <wp:inline xmlns:a="http://schemas.openxmlformats.org/drawingml/2006/main" xmlns:pic="http://schemas.openxmlformats.org/drawingml/2006/picture">
             <wp:extent cx="5580000" cy="1651224"/>
-            <wp:docPr id="4" name="Picture 4"/>
+            <wp:docPr id="6" name="Picture 6"/>
             <wp:cNvGraphicFramePr>
               <a:graphicFrameLocks noChangeAspect="1"/>
             </wp:cNvGraphicFramePr>
@@ -986,7 +1374,7 @@
                     <pic:cNvPicPr/>
                   </pic:nvPicPr>
                   <pic:blipFill>
-                    <a:blip r:embed="rId12"/>
+                    <a:blip r:embed="rId14"/>
                     <a:stretch>
                       <a:fillRect/>
                     </a:stretch>
@@ -1016,7 +1404,7 @@
           <w:color w:val="5A5A5A"/>
           <w:sz w:val="20"/>
         </w:rPr>
-        <w:t>Phase 6, Semantic Analysis: auxflow check, clean and with errors</w:t>
+        <w:t>Phase 6, semantic analysis: auxflow check on a clean and a broken file</w:t>
       </w:r>
     </w:p>
     <w:p>
@@ -1027,7 +1415,7 @@
         <w:drawing>
           <wp:inline xmlns:a="http://schemas.openxmlformats.org/drawingml/2006/main" xmlns:pic="http://schemas.openxmlformats.org/drawingml/2006/picture">
             <wp:extent cx="5580000" cy="1400694"/>
-            <wp:docPr id="5" name="Picture 5"/>
+            <wp:docPr id="7" name="Picture 7"/>
             <wp:cNvGraphicFramePr>
               <a:graphicFrameLocks noChangeAspect="1"/>
             </wp:cNvGraphicFramePr>
@@ -1039,7 +1427,7 @@
                     <pic:cNvPicPr/>
                   </pic:nvPicPr>
                   <pic:blipFill>
-                    <a:blip r:embed="rId13"/>
+                    <a:blip r:embed="rId15"/>
                     <a:stretch>
                       <a:fillRect/>
                     </a:stretch>
@@ -1069,7 +1457,7 @@
           <w:color w:val="5A5A5A"/>
           <w:sz w:val="20"/>
         </w:rPr>
-        <w:t>Phase 7, Intermediate Representation: auxflow graph (Graphviz DOT)</w:t>
+        <w:t>Phase 7, intermediate representation: auxflow graph (Graphviz DOT)</w:t>
       </w:r>
     </w:p>
     <w:p>
@@ -1080,7 +1468,7 @@
         <w:drawing>
           <wp:inline xmlns:a="http://schemas.openxmlformats.org/drawingml/2006/main" xmlns:pic="http://schemas.openxmlformats.org/drawingml/2006/picture">
             <wp:extent cx="5580000" cy="1525959"/>
-            <wp:docPr id="6" name="Picture 6"/>
+            <wp:docPr id="8" name="Picture 8"/>
             <wp:cNvGraphicFramePr>
               <a:graphicFrameLocks noChangeAspect="1"/>
             </wp:cNvGraphicFramePr>
@@ -1092,7 +1480,7 @@
                     <pic:cNvPicPr/>
                   </pic:nvPicPr>
                   <pic:blipFill>
-                    <a:blip r:embed="rId14"/>
+                    <a:blip r:embed="rId16"/>
                     <a:stretch>
                       <a:fillRect/>
                     </a:stretch>
@@ -1122,7 +1510,7 @@
           <w:color w:val="5A5A5A"/>
           <w:sz w:val="20"/>
         </w:rPr>
-        <w:t>Preview of Phase 11 classification: a CERTIFIED document</w:t>
+        <w:t>Phase 11 classifier on the same IR: a CERTIFIED document</w:t>
       </w:r>
     </w:p>
     <w:p>
@@ -1133,7 +1521,7 @@
         <w:drawing>
           <wp:inline xmlns:a="http://schemas.openxmlformats.org/drawingml/2006/main" xmlns:pic="http://schemas.openxmlformats.org/drawingml/2006/picture">
             <wp:extent cx="5580000" cy="1901755"/>
-            <wp:docPr id="7" name="Picture 7"/>
+            <wp:docPr id="9" name="Picture 9"/>
             <wp:cNvGraphicFramePr>
               <a:graphicFrameLocks noChangeAspect="1"/>
             </wp:cNvGraphicFramePr>
@@ -1145,7 +1533,7 @@
                     <pic:cNvPicPr/>
                   </pic:nvPicPr>
                   <pic:blipFill>
-                    <a:blip r:embed="rId15"/>
+                    <a:blip r:embed="rId17"/>
                     <a:stretch>
                       <a:fillRect/>
                     </a:stretch>
@@ -1175,7 +1563,7 @@
           <w:color w:val="5A5A5A"/>
           <w:sz w:val="20"/>
         </w:rPr>
-        <w:t>Preview of Phase 11 classification: an AMPLIFYING document</w:t>
+        <w:t>Phase 11 classifier: an AMPLIFYING document</w:t>
       </w:r>
     </w:p>
     <w:p>
@@ -1186,7 +1574,7 @@
         <w:drawing>
           <wp:inline xmlns:a="http://schemas.openxmlformats.org/drawingml/2006/main" xmlns:pic="http://schemas.openxmlformats.org/drawingml/2006/picture">
             <wp:extent cx="5580000" cy="1400694"/>
-            <wp:docPr id="8" name="Picture 8"/>
+            <wp:docPr id="10" name="Picture 10"/>
             <wp:cNvGraphicFramePr>
               <a:graphicFrameLocks noChangeAspect="1"/>
             </wp:cNvGraphicFramePr>
@@ -1198,7 +1586,7 @@
                     <pic:cNvPicPr/>
                   </pic:nvPicPr>
                   <pic:blipFill>
-                    <a:blip r:embed="rId16"/>
+                    <a:blip r:embed="rId18"/>
                     <a:stretch>
                       <a:fillRect/>
                     </a:stretch>
@@ -1228,21 +1616,21 @@
           <w:color w:val="5A5A5A"/>
           <w:sz w:val="20"/>
         </w:rPr>
-        <w:t>Test suite, type check, and lint, all passing</w:t>
+        <w:t>Test suite, strict type check, and lint</w:t>
       </w:r>
     </w:p>
     <w:p>
       <w:pPr>
+        <w:keepNext/>
         <w:spacing w:after="160"/>
       </w:pPr>
       <w:r>
         <w:rPr>
           <w:rFonts w:ascii="Calibri" w:hAnsi="Calibri"/>
           <w:b/>
-          <w:i w:val="0"/>
           <w:sz w:val="22"/>
         </w:rPr>
-        <w:t>Results obtained so far:</w:t>
+        <w:t>Results</w:t>
       </w:r>
     </w:p>
     <w:p>
@@ -1255,7 +1643,7 @@
           <w:rFonts w:ascii="Calibri" w:hAnsi="Calibri"/>
           <w:sz w:val="22"/>
         </w:rPr>
-        <w:t>Full front-end and IR pipeline (Phases 1-7) implemented and passing its test suite.</w:t>
+        <w:t>All 16 phases are implemented: about 3,930 lines of implementation code in 41 modules, and about 4,080 lines of test code in 46 files. The Review 2 modules (lexer, parser, AST, semantic analysis, IR) are about 2,290 of those lines.</w:t>
       </w:r>
     </w:p>
     <w:p>
@@ -1268,7 +1656,7 @@
           <w:rFonts w:ascii="Calibri" w:hAnsi="Calibri"/>
           <w:sz w:val="22"/>
         </w:rPr>
-        <w:t>~3,900 lines of implementation code and ~4,100 lines of test code.</w:t>
+        <w:t>245 tests pass and 1 is skipped. mypy --strict reports no issues in 41 source files, and ruff reports no lint issues in src, tests, and bench.</w:t>
       </w:r>
     </w:p>
     <w:p>
@@ -1281,7 +1669,7 @@
           <w:rFonts w:ascii="Calibri" w:hAnsi="Calibri"/>
           <w:sz w:val="22"/>
         </w:rPr>
-        <w:t>All code passes strict mypy type checking with zero errors and zero ruff lint/format issues.</w:t>
+        <w:t>The parser recovers from unterminated groups and missing arguments without an exception. Dedicated recovery tests cover these cases.</w:t>
       </w:r>
     </w:p>
     <w:p>
@@ -1294,7 +1682,7 @@
           <w:rFonts w:ascii="Calibri" w:hAnsi="Calibri"/>
           <w:sz w:val="22"/>
         </w:rPr>
-        <w:t>Continuous integration (GitHub Actions) runs on every commit across Python 3.12 and 3.13.</w:t>
+        <w:t>The exists/value split keeps the table-of-contents benchmark (b05_toc) acyclic: it classifies CERTIFIED.</w:t>
       </w:r>
     </w:p>
     <w:p>
@@ -1307,7 +1695,21 @@
           <w:rFonts w:ascii="Calibri" w:hAnsi="Calibri"/>
           <w:sz w:val="22"/>
         </w:rPr>
-        <w:t>The parser correctly recovers from malformed input (unterminated groups, missing arguments) without raising an exception, verified by dedicated error-recovery tests.</w:t>
+        <w:t>On the 15-document corpus, every document classified as predicted before implementation, and both evaluation gates passed.</w:t>
+      </w:r>
+    </w:p>
+    <w:p>
+      <w:pPr>
+        <w:keepNext/>
+        <w:spacing w:after="160"/>
+      </w:pPr>
+      <w:r>
+        <w:rPr>
+          <w:rFonts w:ascii="Calibri" w:hAnsi="Calibri"/>
+          <w:b/>
+          <w:sz w:val="22"/>
+        </w:rPr>
+        <w:t>Remaining work</w:t>
       </w:r>
     </w:p>
     <w:p>
@@ -1320,86 +1722,7 @@
           <w:rFonts w:ascii="Calibri" w:hAnsi="Calibri"/>
           <w:sz w:val="22"/>
         </w:rPr>
-        <w:t>The IR's exists/value split was verified against hand-worked examples to keep ordinary documents (e.g. one containing only a table of contents) acyclic.</w:t>
-      </w:r>
-    </w:p>
-    <w:p>
-      <w:pPr>
-        <w:spacing w:after="160"/>
-      </w:pPr>
-      <w:r>
-        <w:rPr>
-          <w:rFonts w:ascii="Calibri" w:hAnsi="Calibri"/>
-          <w:b/>
-          <w:i w:val="0"/>
-          <w:sz w:val="22"/>
-        </w:rPr>
-        <w:t>Remaining work required to complete the project:</w:t>
-      </w:r>
-    </w:p>
-    <w:p>
-      <w:pPr>
-        <w:pStyle w:val="ListBullet"/>
-        <w:spacing w:after="80"/>
-      </w:pPr>
-      <w:r>
-        <w:rPr>
-          <w:rFonts w:ascii="Calibri" w:hAnsi="Calibri"/>
-          <w:sz w:val="22"/>
-        </w:rPr>
-        <w:t>Phases 8-9: Strongly-connected-component (Tarjan) analysis and taint propagation to detect amplifying feedback.</w:t>
-      </w:r>
-    </w:p>
-    <w:p>
-      <w:pPr>
-        <w:pStyle w:val="ListBullet"/>
-        <w:spacing w:after="80"/>
-      </w:pPr>
-      <w:r>
-        <w:rPr>
-          <w:rFonts w:ascii="Calibri" w:hAnsi="Calibri"/>
-          <w:sz w:val="22"/>
-        </w:rPr>
-        <w:t>Phases 10-11: Stable-pass fixpoint derivation and the four-state document classifier (CERTIFIED / BENIGN_CYCLIC / AMPLIFYING / UNKNOWN).</w:t>
-      </w:r>
-    </w:p>
-    <w:p>
-      <w:pPr>
-        <w:pStyle w:val="ListBullet"/>
-        <w:spacing w:after="80"/>
-      </w:pPr>
-      <w:r>
-        <w:rPr>
-          <w:rFonts w:ascii="Calibri" w:hAnsi="Calibri"/>
-          <w:sz w:val="22"/>
-        </w:rPr>
-        <w:t>Phase 12: Build planner producing a safe, optimised engine-run schedule.</w:t>
-      </w:r>
-    </w:p>
-    <w:p>
-      <w:pPr>
-        <w:pStyle w:val="ListBullet"/>
-        <w:spacing w:after="80"/>
-      </w:pPr>
-      <w:r>
-        <w:rPr>
-          <w:rFonts w:ascii="Calibri" w:hAnsi="Calibri"/>
-          <w:sz w:val="22"/>
-        </w:rPr>
-        <w:t>Phase 13: Runtime verification executor that confirms or corrects static predictions against the real LaTeX engine.</w:t>
-      </w:r>
-    </w:p>
-    <w:p>
-      <w:pPr>
-        <w:pStyle w:val="ListBullet"/>
-        <w:spacing w:after="80"/>
-      </w:pPr>
-      <w:r>
-        <w:rPr>
-          <w:rFonts w:ascii="Calibri" w:hAnsi="Calibri"/>
-          <w:sz w:val="22"/>
-        </w:rPr>
-        <w:t>Phases 14-16: A fifteen-member benchmark corpus, a measurement harness comparing seven baselines, and the final empirical evaluation report.</w:t>
+        <w:t>Write the research paper. The paper/ directory has the section structure, and the evaluation results it needs are available.</w:t>
       </w:r>
     </w:p>
     <w:p>
@@ -1418,13 +1741,19 @@
         </w:rPr>
         <w:t>4. Novelty</w:t>
       </w:r>
+    </w:p>
+    <w:p>
+      <w:pPr>
+        <w:keepNext/>
+        <w:spacing w:after="160"/>
+      </w:pPr>
       <w:r>
         <w:rPr>
-          <w:i/>
-          <w:color w:val="5A5A5A"/>
+          <w:rFonts w:ascii="Calibri" w:hAnsi="Calibri"/>
+          <w:b/>
           <w:sz w:val="22"/>
         </w:rPr>
-        <w:t xml:space="preserve"> (2 Marks)</w:t>
+        <w:t>Contribution</w:t>
       </w:r>
     </w:p>
     <w:p>
@@ -1434,11 +1763,24 @@
       <w:r>
         <w:rPr>
           <w:rFonts w:ascii="Calibri" w:hAnsi="Calibri"/>
-          <w:b/>
-          <w:i w:val="0"/>
+          <w:b w:val="0"/>
           <w:sz w:val="22"/>
         </w:rPr>
-        <w:t>What is new or different about the proposed project?</w:t>
+        <w:t>AuxFlow applies standard compiler construction (lexing, parsing, symbol tables, an intermediate representation, and graph dataflow analysis) to multi-pass LaTeX compilation. Existing tools handle that problem only by running the engine again. The central design choice is an instance-level dependency graph in which each list entry is split into an exists fact and a value fact, so ordinary documents stay acyclic.</w:t>
+      </w:r>
+    </w:p>
+    <w:p>
+      <w:pPr>
+        <w:keepNext/>
+        <w:spacing w:after="160"/>
+      </w:pPr>
+      <w:r>
+        <w:rPr>
+          <w:rFonts w:ascii="Calibri" w:hAnsi="Calibri"/>
+          <w:b/>
+          <w:sz w:val="22"/>
+        </w:rPr>
+        <w:t>Comparison with existing tools</w:t>
       </w:r>
     </w:p>
     <w:p>
@@ -1448,51 +1790,24 @@
       <w:r>
         <w:rPr>
           <w:rFonts w:ascii="Calibri" w:hAnsi="Calibri"/>
-          <w:i w:val="0"/>
+          <w:b w:val="0"/>
           <w:sz w:val="22"/>
         </w:rPr>
-        <w:t>AuxFlow applies standard compiler-construction techniques (lexing, parsing, symbol tables, an intermediate representation, and graph-based dataflow analysis) to a problem domain (multi-pass LaTeX compilation convergence) that is conventionally handled only dynamically, by repeatedly re-running the engine. Building an instance-level dependency graph with a deliberate exists/value split to keep ordinary documents acyclic is the central structural idea.</w:t>
+        <w:t>latexmk, latexrun, and Tectonic decide after each engine run whether another run is needed. They read rerun warnings or compare auxiliary-file checksums. AuxFlow makes this decision from the source before the first run. It classifies the document, predicts the run count when the document is certified, and names the facts and source locations that form a risky cycle.</w:t>
       </w:r>
     </w:p>
     <w:p>
       <w:pPr>
+        <w:keepNext/>
         <w:spacing w:after="160"/>
       </w:pPr>
       <w:r>
         <w:rPr>
           <w:rFonts w:ascii="Calibri" w:hAnsi="Calibri"/>
           <w:b/>
-          <w:i w:val="0"/>
           <w:sz w:val="22"/>
         </w:rPr>
-        <w:t>How does the project differ from existing solutions?</w:t>
-      </w:r>
-    </w:p>
-    <w:p>
-      <w:pPr>
-        <w:spacing w:after="160"/>
-      </w:pPr>
-      <w:r>
-        <w:rPr>
-          <w:rFonts w:ascii="Calibri" w:hAnsi="Calibri"/>
-          <w:i w:val="0"/>
-          <w:sz w:val="22"/>
-        </w:rPr>
-        <w:t xml:space="preserve">Existing tools (plain LaTeX, latexmk, latexrun, Tectonic) all decide whether another compilation pass is needed dynamically: by re-running the engine and inspecting warnings or comparing auxiliary-file checksums after each run. None of them reason about the dependency structure before execution. AuxFlow instead performs this reasoning statically, from source, before any engine pass, classifying the document </w:t>
-      </w:r>
-    </w:p>
-    <w:p>
-      <w:pPr>
-        <w:spacing w:after="160"/>
-      </w:pPr>
-      <w:r>
-        <w:rPr>
-          <w:rFonts w:ascii="Calibri" w:hAnsi="Calibri"/>
-          <w:b/>
-          <w:i w:val="0"/>
-          <w:sz w:val="22"/>
-        </w:rPr>
-        <w:t>What specific improvement, feature, or approach does it introduce?</w:t>
+        <w:t>Specific techniques</w:t>
       </w:r>
     </w:p>
     <w:p>
@@ -1505,7 +1820,7 @@
           <w:rFonts w:ascii="Calibri" w:hAnsi="Calibri"/>
           <w:sz w:val="22"/>
         </w:rPr>
-        <w:t>A declared, explicit LaTeX language subset with a documented default-deny rule: anything outside the subset is conservatively marked UNKNOWN rather than silently assumed safe.</w:t>
+        <w:t>A declared LaTeX subset with a default-deny rule: an unsupported construct makes the document UNKNOWN, and the tool does not assume it is safe.</w:t>
       </w:r>
     </w:p>
     <w:p>
@@ -1518,7 +1833,7 @@
           <w:rFonts w:ascii="Calibri" w:hAnsi="Calibri"/>
           <w:sz w:val="22"/>
         </w:rPr>
-        <w:t>The exists/value fact split in the Intermediate Representation, which prevents the most common document shape (a table of contents) from appearing as a false cycle.</w:t>
+        <w:t>The exists/value split in the IR, which stops a table of contents from appearing as a false cycle.</w:t>
       </w:r>
     </w:p>
     <w:p>
@@ -1531,7 +1846,7 @@
           <w:rFonts w:ascii="Calibri" w:hAnsi="Calibri"/>
           <w:sz w:val="22"/>
         </w:rPr>
-        <w:t>A four-state classification (rather than a binary converges/does-not-converge verdict) that distinguishes harmless value-only cycles from genuinely amplifying feedback.</w:t>
+        <w:t>Four classification states. Value-only cycles (BENIGN_CYCLIC) are kept separate from cycles in which a value controls how much content is generated (AMPLIFYING).</w:t>
       </w:r>
     </w:p>
     <w:p>
@@ -1544,86 +1859,7 @@
           <w:rFonts w:ascii="Calibri" w:hAnsi="Calibri"/>
           <w:sz w:val="22"/>
         </w:rPr>
-        <w:t>A static analysis that is explicitly paired with, not a replacement for, runtime verification; it does not claim certainty it cannot support.</w:t>
-      </w:r>
-    </w:p>
-    <w:p>
-      <w:pPr>
-        <w:spacing w:before="360" w:after="120"/>
-        <w:pBdr>
-          <w:bottom w:val="single" w:sz="6" w:space="4" w:color="1B3A57"/>
-        </w:pBdr>
-      </w:pPr>
-      <w:r>
-        <w:rPr>
-          <w:rFonts w:ascii="Calibri" w:hAnsi="Calibri"/>
-          <w:b/>
-          <w:color w:val="0D1B2A"/>
-          <w:sz w:val="32"/>
-        </w:rPr>
-        <w:t>5. Presentation and Q&amp;A</w:t>
-      </w:r>
-      <w:r>
-        <w:rPr>
-          <w:i/>
-          <w:color w:val="5A5A5A"/>
-          <w:sz w:val="22"/>
-        </w:rPr>
-        <w:t xml:space="preserve"> (3 Marks)</w:t>
-      </w:r>
-    </w:p>
-    <w:p>
-      <w:pPr>
-        <w:spacing w:after="160"/>
-      </w:pPr>
-      <w:r>
-        <w:rPr>
-          <w:rFonts w:ascii="Calibri" w:hAnsi="Calibri"/>
-          <w:b/>
-          <w:i w:val="0"/>
-          <w:sz w:val="22"/>
-        </w:rPr>
-        <w:t>Clear explanation of the problem, methodology, and implementation:</w:t>
-      </w:r>
-    </w:p>
-    <w:p>
-      <w:pPr>
-        <w:spacing w:after="160"/>
-      </w:pPr>
-      <w:r>
-        <w:rPr>
-          <w:rFonts w:ascii="Calibri" w:hAnsi="Calibri"/>
-          <w:i w:val="0"/>
-          <w:sz w:val="22"/>
-        </w:rPr>
-        <w:t>Presented via the accompanying slide deck (presentation/review2-auxflow.pptx) and viva preparation guide (docs/review2-viva.md), covering: why this is a compiler project; the lexer's category-code model; the recursive-descent parser and error recovery; the two-pass symbol table resolution; and the Auxiliary Reference Graph, including a worked end-to-end trace from a source snippet through tokens, AST, symbol bindings, and final IR facts and edges.</w:t>
-      </w:r>
-    </w:p>
-    <w:p>
-      <w:pPr>
-        <w:spacing w:after="160"/>
-      </w:pPr>
-      <w:r>
-        <w:rPr>
-          <w:rFonts w:ascii="Calibri" w:hAnsi="Calibri"/>
-          <w:b/>
-          <w:i w:val="0"/>
-          <w:sz w:val="22"/>
-        </w:rPr>
-        <w:t>Explanation of individual contributions:</w:t>
-      </w:r>
-    </w:p>
-    <w:p>
-      <w:pPr>
-        <w:spacing w:after="160"/>
-      </w:pPr>
-      <w:r>
-        <w:rPr>
-          <w:rFonts w:ascii="Calibri" w:hAnsi="Calibri"/>
-          <w:i w:val="0"/>
-          <w:sz w:val="22"/>
-        </w:rPr>
-        <w:t>This is a single-student project. Upayan Mazumder (24BDS0367) is solely responsible for the design and implementation of all completed modules: the lexer, parser, AST, inclusion-graph resolution, symbol tables, semantic diagnostics, the Intermediate Representation, the command-line interface, the full test suite, and the continuous integration configuration.</w:t>
+        <w:t>Static prediction paired with runtime verification. The verifier records a prediction miss when the real run count exceeds the prediction.</w:t>
       </w:r>
     </w:p>
     <w:sectPr>

</xml_diff>